<commit_message>
luong du lieu file
</commit_message>
<xml_diff>
--- a/Doc/OnTap/6_SCAM_based_TCAM.docx
+++ b/Doc/OnTap/6_SCAM_based_TCAM.docx
@@ -17,11 +17,7 @@
       </w:pPr>
       <w:r>
         <w:rPr/>
-        <w:t xml:space="preserve">Thiết kế </w:t>
-      </w:r>
-      <w:r>
-        <w:rPr/>
-        <w:t>thư mục dự án</w:t>
+        <w:t>Thiết kế thư mục dự án</w:t>
       </w:r>
     </w:p>
     <w:p>
@@ -101,11 +97,7 @@
       </w:r>
       <w:r>
         <w:rPr/>
-        <w:t xml:space="preserve">rtl </w:t>
-      </w:r>
-      <w:r>
-        <w:rPr/>
-        <w:t xml:space="preserve">- </w:t>
+        <w:t xml:space="preserve">rtl - </w:t>
       </w:r>
       <w:r>
         <w:rPr>
@@ -229,7 +221,7 @@
     </w:p>
     <w:p>
       <w:pPr>
-        <w:pStyle w:val="BlockQuotation"/>
+        <w:pStyle w:val="BlockQuotationuser"/>
         <w:spacing w:lineRule="auto" w:line="276" w:before="0" w:after="140"/>
         <w:rPr/>
       </w:pPr>
@@ -406,11 +398,7 @@
       </w:pPr>
       <w:r>
         <w:rPr/>
-        <w:t xml:space="preserve">2) </w:t>
-      </w:r>
-      <w:r>
-        <w:rPr/>
-        <w:t>top.v là gì</w:t>
+        <w:t>2) top.v là gì</w:t>
       </w:r>
     </w:p>
     <w:p>
@@ -475,7 +463,6 @@
           <w:type w:val="continuous"/>
           <w:pgSz w:w="12240" w:h="15840"/>
           <w:pgMar w:left="1134" w:right="1134" w:gutter="0" w:header="0" w:top="1134" w:footer="0" w:bottom="1134"/>
-          <w:pgNumType w:fmt="decimal"/>
           <w:formProt w:val="false"/>
           <w:textDirection w:val="lrTb"/>
           <w:docGrid w:type="default" w:linePitch="100" w:charSpace="0"/>
@@ -1807,11 +1794,7 @@
       </w:pPr>
       <w:r>
         <w:rPr/>
-        <w:t xml:space="preserve">3) </w:t>
-      </w:r>
-      <w:r>
-        <w:rPr/>
-        <w:t>tb là gì</w:t>
+        <w:t>3) tb là gì</w:t>
       </w:r>
     </w:p>
     <w:p>
@@ -1867,7 +1850,7 @@
           <w:szCs w:val="24"/>
         </w:rPr>
       </w:pPr>
-      <w:bookmarkStart w:id="2" w:name="code-block-viewer_Copy_1"/>
+      <w:bookmarkStart w:id="2" w:name="code-block-viewer_Copy_1_Copy_1"/>
       <w:bookmarkEnd w:id="2"/>
       <w:r>
         <w:rPr>
@@ -2013,11 +1996,7 @@
       </w:pPr>
       <w:r>
         <w:rPr/>
-        <w:t xml:space="preserve">4) </w:t>
-      </w:r>
-      <w:r>
-        <w:rPr/>
-        <w:t>top_tv.v là gì</w:t>
+        <w:t>4) top_tv.v là gì</w:t>
       </w:r>
     </w:p>
     <w:p>
@@ -3859,13 +3838,7 @@
         <w:rPr>
           <w:rStyle w:val="SourceText"/>
         </w:rPr>
-        <w:t>5)</w:t>
-      </w:r>
-      <w:r>
-        <w:rPr>
-          <w:rStyle w:val="SourceText"/>
-        </w:rPr>
-        <w:t>sim/</w:t>
+        <w:t>5)sim/</w:t>
       </w:r>
       <w:r>
         <w:rPr/>
@@ -3943,11 +3916,6 @@
           <w:shd w:fill="FFFF00" w:val="clear"/>
         </w:rPr>
         <w:tab/>
-      </w:r>
-      <w:r>
-        <w:rPr>
-          <w:shd w:fill="FFFF00" w:val="clear"/>
-        </w:rPr>
         <w:t>wave.vcd</w:t>
       </w:r>
     </w:p>
@@ -3970,11 +3938,6 @@
           <w:shd w:fill="FFFF00" w:val="clear"/>
         </w:rPr>
         <w:tab/>
-      </w:r>
-      <w:r>
-        <w:rPr>
-          <w:shd w:fill="FFFF00" w:val="clear"/>
-        </w:rPr>
         <w:t>simulation.log</w:t>
       </w:r>
     </w:p>
@@ -3997,27 +3960,263 @@
           <w:shd w:fill="FFFF00" w:val="clear"/>
         </w:rPr>
         <w:tab/>
-      </w:r>
-      <w:r>
-        <w:rPr>
-          <w:shd w:fill="FFFF00" w:val="clear"/>
-        </w:rPr>
         <w:t>run.do</w:t>
       </w:r>
     </w:p>
     <w:p>
       <w:pPr>
-        <w:pStyle w:val="BodyText"/>
+        <w:pStyle w:val="Heading1"/>
         <w:numPr>
           <w:ilvl w:val="0"/>
-          <w:numId w:val="0"/>
+          <w:numId w:val="1"/>
         </w:numPr>
-        <w:spacing w:before="240" w:after="120"/>
         <w:ind w:hanging="0" w:start="0"/>
         <w:rPr/>
       </w:pPr>
       <w:r>
         <w:rPr/>
+        <w:t xml:space="preserve">Kiến trúc hệ thống </w:t>
+      </w:r>
+    </w:p>
+    <w:p>
+      <w:pPr>
+        <w:pStyle w:val="BodyText"/>
+        <w:rPr/>
+      </w:pPr>
+      <w:r>
+        <w:rPr/>
+        <w:t>Ở đề tài này ta sẽ phân tích gói tin packet, đọc nội dung header của packet đó , tạo ra search-key, đưa search-key này vao rule-table trong sram-based-tcam, được danh sách kết quả cho vào priority-encoder chọn kết quả duy nhất. Kết quả này dựa theo hệ thống (firewall/router/switch) sẽ tiến hành (Forward/drop/QoS/ACL)</w:t>
+      </w:r>
+    </w:p>
+    <w:p>
+      <w:pPr>
+        <w:pStyle w:val="BodyText"/>
+        <w:rPr/>
+      </w:pPr>
+      <w:r>
+        <w:rPr/>
+      </w:r>
+      <w:r>
+        <mc:AlternateContent>
+          <mc:Choice Requires="wps">
+            <w:drawing>
+              <wp:anchor distT="0" distB="0" distL="0" distR="0" simplePos="0" relativeHeight="3" behindDoc="0" locked="0" layoutInCell="0" allowOverlap="1">
+                <wp:simplePos x="0" y="0"/>
+                <wp:positionH relativeFrom="column">
+                  <wp:align>center</wp:align>
+                </wp:positionH>
+                <wp:positionV relativeFrom="paragraph">
+                  <wp:posOffset>635</wp:posOffset>
+                </wp:positionV>
+                <wp:extent cx="1819275" cy="6036945"/>
+                <wp:effectExtent l="0" t="0" r="0" b="0"/>
+                <wp:wrapTopAndBottom/>
+                <wp:docPr id="2" name="Frame1"/>
+                <a:graphic xmlns:a="http://schemas.openxmlformats.org/drawingml/2006/main">
+                  <a:graphicData uri="http://schemas.microsoft.com/office/word/2010/wordprocessingShape">
+                    <wps:wsp>
+                      <wps:cNvSpPr txBox="1"/>
+                      <wps:spPr>
+                        <a:xfrm>
+                          <a:off x="0" y="0"/>
+                          <a:ext cx="1819275" cy="6036945"/>
+                        </a:xfrm>
+                        <a:prstGeom prst="rect"/>
+                        <a:solidFill>
+                          <a:srgbClr val="FFFFFF"/>
+                        </a:solidFill>
+                      </wps:spPr>
+                      <wps:txbx>
+                        <w:txbxContent>
+                          <w:p>
+                            <w:pPr>
+                              <w:pStyle w:val="Figure"/>
+                              <w:spacing w:before="120" w:after="120"/>
+                              <w:rPr/>
+                            </w:pPr>
+                            <w:r>
+                              <w:rPr/>
+                              <w:drawing>
+                                <wp:inline distT="0" distB="0" distL="0" distR="0">
+                                  <wp:extent cx="1819275" cy="5534025"/>
+                                  <wp:effectExtent l="0" t="0" r="0" b="0"/>
+                                  <wp:docPr id="3" name="Image2"/>
+                                  <wp:cNvGraphicFramePr>
+                                    <a:graphicFrameLocks xmlns:a="http://schemas.openxmlformats.org/drawingml/2006/main" noChangeAspect="1"/>
+                                  </wp:cNvGraphicFramePr>
+                                  <a:graphic xmlns:a="http://schemas.openxmlformats.org/drawingml/2006/main">
+                                    <a:graphicData uri="http://schemas.openxmlformats.org/drawingml/2006/picture">
+                                      <pic:pic xmlns:pic="http://schemas.openxmlformats.org/drawingml/2006/picture">
+                                        <pic:nvPicPr>
+                                          <pic:cNvPr id="3" name="Image2"/>
+                                          <pic:cNvPicPr>
+                                            <a:picLocks noChangeAspect="1" noChangeArrowheads="1"/>
+                                          </pic:cNvPicPr>
+                                        </pic:nvPicPr>
+                                        <pic:blipFill>
+                                          <a:blip r:embed="rId3"/>
+                                          <a:stretch>
+                                            <a:fillRect/>
+                                          </a:stretch>
+                                        </pic:blipFill>
+                                        <pic:spPr bwMode="auto">
+                                          <a:xfrm>
+                                            <a:off x="0" y="0"/>
+                                            <a:ext cx="1819275" cy="5534025"/>
+                                          </a:xfrm>
+                                          <a:prstGeom prst="rect">
+                                            <a:avLst/>
+                                          </a:prstGeom>
+                                          <a:noFill/>
+                                        </pic:spPr>
+                                      </pic:pic>
+                                    </a:graphicData>
+                                  </a:graphic>
+                                </wp:inline>
+                              </w:drawing>
+                              <w:t xml:space="preserve">Figure </w:t>
+                            </w:r>
+                            <w:r>
+                              <w:rPr/>
+                              <w:fldChar w:fldCharType="begin"/>
+                            </w:r>
+                            <w:r>
+                              <w:rPr/>
+                              <w:instrText xml:space="preserve"> SEQ Figure \* ARABIC </w:instrText>
+                            </w:r>
+                            <w:r>
+                              <w:rPr/>
+                              <w:fldChar w:fldCharType="separate"/>
+                            </w:r>
+                            <w:r>
+                              <w:rPr/>
+                              <w:t>1</w:t>
+                            </w:r>
+                            <w:r>
+                              <w:rPr/>
+                              <w:fldChar w:fldCharType="end"/>
+                            </w:r>
+                            <w:r>
+                              <w:rPr/>
+                              <w:t>:  Luồng dữ liệu SRAM_based_TCAM</w:t>
+                            </w:r>
+                          </w:p>
+                        </w:txbxContent>
+                      </wps:txbx>
+                      <wps:bodyPr anchor="t" lIns="0" tIns="0" rIns="0" bIns="0">
+                        <a:noAutofit/>
+                      </wps:bodyPr>
+                    </wps:wsp>
+                  </a:graphicData>
+                </a:graphic>
+              </wp:anchor>
+            </w:drawing>
+          </mc:Choice>
+          <mc:Fallback>
+            <w:pict>
+              <v:rect style="position:absolute;rotation:-0;width:143.25pt;height:475.35pt;mso-wrap-distance-left:0pt;mso-wrap-distance-right:0pt;mso-wrap-distance-top:0pt;mso-wrap-distance-bottom:0pt;margin-top:0pt;mso-position-vertical:top;mso-position-vertical-relative:text;margin-left:177.7pt;mso-position-horizontal:center;mso-position-horizontal-relative:text">
+                <v:textbox inset="0in,0in,0in,0in">
+                  <w:txbxContent>
+                    <w:p>
+                      <w:pPr>
+                        <w:pStyle w:val="Figure"/>
+                        <w:spacing w:before="120" w:after="120"/>
+                        <w:rPr/>
+                      </w:pPr>
+                      <w:r>
+                        <w:rPr/>
+                        <w:drawing>
+                          <wp:inline distT="0" distB="0" distL="0" distR="0">
+                            <wp:extent cx="1819275" cy="5534025"/>
+                            <wp:effectExtent l="0" t="0" r="0" b="0"/>
+                            <wp:docPr id="4" name="Image2"/>
+                            <wp:cNvGraphicFramePr>
+                              <a:graphicFrameLocks xmlns:a="http://schemas.openxmlformats.org/drawingml/2006/main" noChangeAspect="1"/>
+                            </wp:cNvGraphicFramePr>
+                            <a:graphic xmlns:a="http://schemas.openxmlformats.org/drawingml/2006/main">
+                              <a:graphicData uri="http://schemas.openxmlformats.org/drawingml/2006/picture">
+                                <pic:pic xmlns:pic="http://schemas.openxmlformats.org/drawingml/2006/picture">
+                                  <pic:nvPicPr>
+                                    <pic:cNvPr id="4" name="Image2"/>
+                                    <pic:cNvPicPr>
+                                      <a:picLocks noChangeAspect="1" noChangeArrowheads="1"/>
+                                    </pic:cNvPicPr>
+                                  </pic:nvPicPr>
+                                  <pic:blipFill>
+                                    <a:blip r:embed="rId4"/>
+                                    <a:stretch>
+                                      <a:fillRect/>
+                                    </a:stretch>
+                                  </pic:blipFill>
+                                  <pic:spPr bwMode="auto">
+                                    <a:xfrm>
+                                      <a:off x="0" y="0"/>
+                                      <a:ext cx="1819275" cy="5534025"/>
+                                    </a:xfrm>
+                                    <a:prstGeom prst="rect">
+                                      <a:avLst/>
+                                    </a:prstGeom>
+                                    <a:noFill/>
+                                  </pic:spPr>
+                                </pic:pic>
+                              </a:graphicData>
+                            </a:graphic>
+                          </wp:inline>
+                        </w:drawing>
+                        <w:t xml:space="preserve">Figure </w:t>
+                      </w:r>
+                      <w:r>
+                        <w:rPr/>
+                        <w:fldChar w:fldCharType="begin"/>
+                      </w:r>
+                      <w:r>
+                        <w:rPr/>
+                        <w:instrText xml:space="preserve"> SEQ Figure \* ARABIC </w:instrText>
+                      </w:r>
+                      <w:r>
+                        <w:rPr/>
+                        <w:fldChar w:fldCharType="separate"/>
+                      </w:r>
+                      <w:r>
+                        <w:rPr/>
+                        <w:t>1</w:t>
+                      </w:r>
+                      <w:r>
+                        <w:rPr/>
+                        <w:fldChar w:fldCharType="end"/>
+                      </w:r>
+                      <w:r>
+                        <w:rPr/>
+                        <w:t>:  Luồng dữ liệu SRAM_based_TCAM</w:t>
+                      </w:r>
+                    </w:p>
+                  </w:txbxContent>
+                </v:textbox>
+                <w10:wrap type="topAndBottom"/>
+              </v:rect>
+            </w:pict>
+          </mc:Fallback>
+        </mc:AlternateContent>
+      </w:r>
+    </w:p>
+    <w:p>
+      <w:pPr>
+        <w:pStyle w:val="BodyText"/>
+        <w:rPr/>
+      </w:pPr>
+      <w:r>
+        <w:rPr/>
+      </w:r>
+    </w:p>
+    <w:p>
+      <w:pPr>
+        <w:pStyle w:val="BodyText"/>
+        <w:spacing w:before="0" w:after="140"/>
+        <w:rPr/>
+      </w:pPr>
+      <w:r>
+        <w:rPr/>
+        <w:t xml:space="preserve"> </w:t>
       </w:r>
     </w:p>
     <w:sectPr>
@@ -4558,363 +4757,6 @@
   <w:abstractNum w:abstractNumId="5">
     <w:lvl w:ilvl="0">
       <w:start w:val="1"/>
-      <w:numFmt w:val="decimal"/>
-      <w:lvlText w:val="%1)"/>
-      <w:lvlJc w:val="start"/>
-      <w:pPr>
-        <w:tabs>
-          <w:tab w:val="num" w:pos="720"/>
-        </w:tabs>
-        <w:ind w:start="720" w:hanging="360"/>
-      </w:pPr>
-      <w:rPr/>
-    </w:lvl>
-    <w:lvl w:ilvl="1">
-      <w:start w:val="1"/>
-      <w:numFmt w:val="decimal"/>
-      <w:lvlText w:val="%2)"/>
-      <w:lvlJc w:val="start"/>
-      <w:pPr>
-        <w:tabs>
-          <w:tab w:val="num" w:pos="1080"/>
-        </w:tabs>
-        <w:ind w:start="1080" w:hanging="360"/>
-      </w:pPr>
-      <w:rPr/>
-    </w:lvl>
-    <w:lvl w:ilvl="2">
-      <w:start w:val="1"/>
-      <w:numFmt w:val="decimal"/>
-      <w:lvlText w:val="%3)"/>
-      <w:lvlJc w:val="start"/>
-      <w:pPr>
-        <w:tabs>
-          <w:tab w:val="num" w:pos="1440"/>
-        </w:tabs>
-        <w:ind w:start="1440" w:hanging="360"/>
-      </w:pPr>
-      <w:rPr/>
-    </w:lvl>
-    <w:lvl w:ilvl="3">
-      <w:start w:val="1"/>
-      <w:numFmt w:val="decimal"/>
-      <w:lvlText w:val="%4)"/>
-      <w:lvlJc w:val="start"/>
-      <w:pPr>
-        <w:tabs>
-          <w:tab w:val="num" w:pos="1800"/>
-        </w:tabs>
-        <w:ind w:start="1800" w:hanging="360"/>
-      </w:pPr>
-      <w:rPr/>
-    </w:lvl>
-    <w:lvl w:ilvl="4">
-      <w:start w:val="1"/>
-      <w:numFmt w:val="decimal"/>
-      <w:lvlText w:val="%5)"/>
-      <w:lvlJc w:val="start"/>
-      <w:pPr>
-        <w:tabs>
-          <w:tab w:val="num" w:pos="2160"/>
-        </w:tabs>
-        <w:ind w:start="2160" w:hanging="360"/>
-      </w:pPr>
-      <w:rPr/>
-    </w:lvl>
-    <w:lvl w:ilvl="5">
-      <w:start w:val="1"/>
-      <w:numFmt w:val="decimal"/>
-      <w:lvlText w:val="%6)"/>
-      <w:lvlJc w:val="start"/>
-      <w:pPr>
-        <w:tabs>
-          <w:tab w:val="num" w:pos="2520"/>
-        </w:tabs>
-        <w:ind w:start="2520" w:hanging="360"/>
-      </w:pPr>
-      <w:rPr/>
-    </w:lvl>
-    <w:lvl w:ilvl="6">
-      <w:start w:val="1"/>
-      <w:numFmt w:val="decimal"/>
-      <w:lvlText w:val="%7)"/>
-      <w:lvlJc w:val="start"/>
-      <w:pPr>
-        <w:tabs>
-          <w:tab w:val="num" w:pos="2880"/>
-        </w:tabs>
-        <w:ind w:start="2880" w:hanging="360"/>
-      </w:pPr>
-      <w:rPr/>
-    </w:lvl>
-    <w:lvl w:ilvl="7">
-      <w:start w:val="1"/>
-      <w:numFmt w:val="decimal"/>
-      <w:lvlText w:val="%8)"/>
-      <w:lvlJc w:val="start"/>
-      <w:pPr>
-        <w:tabs>
-          <w:tab w:val="num" w:pos="3240"/>
-        </w:tabs>
-        <w:ind w:start="3240" w:hanging="360"/>
-      </w:pPr>
-      <w:rPr/>
-    </w:lvl>
-    <w:lvl w:ilvl="8">
-      <w:start w:val="1"/>
-      <w:numFmt w:val="decimal"/>
-      <w:lvlText w:val="%9)"/>
-      <w:lvlJc w:val="start"/>
-      <w:pPr>
-        <w:tabs>
-          <w:tab w:val="num" w:pos="3600"/>
-        </w:tabs>
-        <w:ind w:start="3600" w:hanging="360"/>
-      </w:pPr>
-      <w:rPr/>
-    </w:lvl>
-  </w:abstractNum>
-  <w:abstractNum w:abstractNumId="6">
-    <w:lvl w:ilvl="0">
-      <w:start w:val="1"/>
-      <w:numFmt w:val="decimal"/>
-      <w:lvlText w:val="%1)"/>
-      <w:lvlJc w:val="start"/>
-      <w:pPr>
-        <w:tabs>
-          <w:tab w:val="num" w:pos="720"/>
-        </w:tabs>
-        <w:ind w:start="720" w:hanging="360"/>
-      </w:pPr>
-      <w:rPr/>
-    </w:lvl>
-    <w:lvl w:ilvl="1">
-      <w:start w:val="1"/>
-      <w:numFmt w:val="decimal"/>
-      <w:lvlText w:val="%2)"/>
-      <w:lvlJc w:val="start"/>
-      <w:pPr>
-        <w:tabs>
-          <w:tab w:val="num" w:pos="1080"/>
-        </w:tabs>
-        <w:ind w:start="1080" w:hanging="360"/>
-      </w:pPr>
-      <w:rPr/>
-    </w:lvl>
-    <w:lvl w:ilvl="2">
-      <w:start w:val="1"/>
-      <w:numFmt w:val="decimal"/>
-      <w:lvlText w:val="%3)"/>
-      <w:lvlJc w:val="start"/>
-      <w:pPr>
-        <w:tabs>
-          <w:tab w:val="num" w:pos="1440"/>
-        </w:tabs>
-        <w:ind w:start="1440" w:hanging="360"/>
-      </w:pPr>
-      <w:rPr/>
-    </w:lvl>
-    <w:lvl w:ilvl="3">
-      <w:start w:val="1"/>
-      <w:numFmt w:val="decimal"/>
-      <w:lvlText w:val="%4)"/>
-      <w:lvlJc w:val="start"/>
-      <w:pPr>
-        <w:tabs>
-          <w:tab w:val="num" w:pos="1800"/>
-        </w:tabs>
-        <w:ind w:start="1800" w:hanging="360"/>
-      </w:pPr>
-      <w:rPr/>
-    </w:lvl>
-    <w:lvl w:ilvl="4">
-      <w:start w:val="1"/>
-      <w:numFmt w:val="decimal"/>
-      <w:lvlText w:val="%5)"/>
-      <w:lvlJc w:val="start"/>
-      <w:pPr>
-        <w:tabs>
-          <w:tab w:val="num" w:pos="2160"/>
-        </w:tabs>
-        <w:ind w:start="2160" w:hanging="360"/>
-      </w:pPr>
-      <w:rPr/>
-    </w:lvl>
-    <w:lvl w:ilvl="5">
-      <w:start w:val="1"/>
-      <w:numFmt w:val="decimal"/>
-      <w:lvlText w:val="%6)"/>
-      <w:lvlJc w:val="start"/>
-      <w:pPr>
-        <w:tabs>
-          <w:tab w:val="num" w:pos="2520"/>
-        </w:tabs>
-        <w:ind w:start="2520" w:hanging="360"/>
-      </w:pPr>
-      <w:rPr/>
-    </w:lvl>
-    <w:lvl w:ilvl="6">
-      <w:start w:val="1"/>
-      <w:numFmt w:val="decimal"/>
-      <w:lvlText w:val="%7)"/>
-      <w:lvlJc w:val="start"/>
-      <w:pPr>
-        <w:tabs>
-          <w:tab w:val="num" w:pos="2880"/>
-        </w:tabs>
-        <w:ind w:start="2880" w:hanging="360"/>
-      </w:pPr>
-      <w:rPr/>
-    </w:lvl>
-    <w:lvl w:ilvl="7">
-      <w:start w:val="1"/>
-      <w:numFmt w:val="decimal"/>
-      <w:lvlText w:val="%8)"/>
-      <w:lvlJc w:val="start"/>
-      <w:pPr>
-        <w:tabs>
-          <w:tab w:val="num" w:pos="3240"/>
-        </w:tabs>
-        <w:ind w:start="3240" w:hanging="360"/>
-      </w:pPr>
-      <w:rPr/>
-    </w:lvl>
-    <w:lvl w:ilvl="8">
-      <w:start w:val="1"/>
-      <w:numFmt w:val="decimal"/>
-      <w:lvlText w:val="%9)"/>
-      <w:lvlJc w:val="start"/>
-      <w:pPr>
-        <w:tabs>
-          <w:tab w:val="num" w:pos="3600"/>
-        </w:tabs>
-        <w:ind w:start="3600" w:hanging="360"/>
-      </w:pPr>
-      <w:rPr/>
-    </w:lvl>
-  </w:abstractNum>
-  <w:abstractNum w:abstractNumId="7">
-    <w:lvl w:ilvl="0">
-      <w:start w:val="1"/>
-      <w:numFmt w:val="decimal"/>
-      <w:lvlText w:val="%1)"/>
-      <w:lvlJc w:val="start"/>
-      <w:pPr>
-        <w:tabs>
-          <w:tab w:val="num" w:pos="720"/>
-        </w:tabs>
-        <w:ind w:start="720" w:hanging="360"/>
-      </w:pPr>
-      <w:rPr/>
-    </w:lvl>
-    <w:lvl w:ilvl="1">
-      <w:start w:val="1"/>
-      <w:numFmt w:val="decimal"/>
-      <w:lvlText w:val="%2)"/>
-      <w:lvlJc w:val="start"/>
-      <w:pPr>
-        <w:tabs>
-          <w:tab w:val="num" w:pos="1080"/>
-        </w:tabs>
-        <w:ind w:start="1080" w:hanging="360"/>
-      </w:pPr>
-      <w:rPr/>
-    </w:lvl>
-    <w:lvl w:ilvl="2">
-      <w:start w:val="1"/>
-      <w:numFmt w:val="decimal"/>
-      <w:lvlText w:val="%3)"/>
-      <w:lvlJc w:val="start"/>
-      <w:pPr>
-        <w:tabs>
-          <w:tab w:val="num" w:pos="1440"/>
-        </w:tabs>
-        <w:ind w:start="1440" w:hanging="360"/>
-      </w:pPr>
-      <w:rPr/>
-    </w:lvl>
-    <w:lvl w:ilvl="3">
-      <w:start w:val="1"/>
-      <w:numFmt w:val="decimal"/>
-      <w:lvlText w:val="%4)"/>
-      <w:lvlJc w:val="start"/>
-      <w:pPr>
-        <w:tabs>
-          <w:tab w:val="num" w:pos="1800"/>
-        </w:tabs>
-        <w:ind w:start="1800" w:hanging="360"/>
-      </w:pPr>
-      <w:rPr/>
-    </w:lvl>
-    <w:lvl w:ilvl="4">
-      <w:start w:val="1"/>
-      <w:numFmt w:val="decimal"/>
-      <w:lvlText w:val="%5)"/>
-      <w:lvlJc w:val="start"/>
-      <w:pPr>
-        <w:tabs>
-          <w:tab w:val="num" w:pos="2160"/>
-        </w:tabs>
-        <w:ind w:start="2160" w:hanging="360"/>
-      </w:pPr>
-      <w:rPr/>
-    </w:lvl>
-    <w:lvl w:ilvl="5">
-      <w:start w:val="1"/>
-      <w:numFmt w:val="decimal"/>
-      <w:lvlText w:val="%6)"/>
-      <w:lvlJc w:val="start"/>
-      <w:pPr>
-        <w:tabs>
-          <w:tab w:val="num" w:pos="2520"/>
-        </w:tabs>
-        <w:ind w:start="2520" w:hanging="360"/>
-      </w:pPr>
-      <w:rPr/>
-    </w:lvl>
-    <w:lvl w:ilvl="6">
-      <w:start w:val="1"/>
-      <w:numFmt w:val="decimal"/>
-      <w:lvlText w:val="%7)"/>
-      <w:lvlJc w:val="start"/>
-      <w:pPr>
-        <w:tabs>
-          <w:tab w:val="num" w:pos="2880"/>
-        </w:tabs>
-        <w:ind w:start="2880" w:hanging="360"/>
-      </w:pPr>
-      <w:rPr/>
-    </w:lvl>
-    <w:lvl w:ilvl="7">
-      <w:start w:val="1"/>
-      <w:numFmt w:val="decimal"/>
-      <w:lvlText w:val="%8)"/>
-      <w:lvlJc w:val="start"/>
-      <w:pPr>
-        <w:tabs>
-          <w:tab w:val="num" w:pos="3240"/>
-        </w:tabs>
-        <w:ind w:start="3240" w:hanging="360"/>
-      </w:pPr>
-      <w:rPr/>
-    </w:lvl>
-    <w:lvl w:ilvl="8">
-      <w:start w:val="1"/>
-      <w:numFmt w:val="decimal"/>
-      <w:lvlText w:val="%9)"/>
-      <w:lvlJc w:val="start"/>
-      <w:pPr>
-        <w:tabs>
-          <w:tab w:val="num" w:pos="3600"/>
-        </w:tabs>
-        <w:ind w:start="3600" w:hanging="360"/>
-      </w:pPr>
-      <w:rPr/>
-    </w:lvl>
-  </w:abstractNum>
-  <w:abstractNum w:abstractNumId="8">
-    <w:lvl w:ilvl="0">
-      <w:start w:val="1"/>
       <w:numFmt w:val="none"/>
       <w:suff w:val="nothing"/>
       <w:lvlText w:val=""/>
@@ -5045,15 +4887,6 @@
   </w:num>
   <w:num w:numId="5">
     <w:abstractNumId w:val="5"/>
-  </w:num>
-  <w:num w:numId="6">
-    <w:abstractNumId w:val="6"/>
-  </w:num>
-  <w:num w:numId="7">
-    <w:abstractNumId w:val="7"/>
-  </w:num>
-  <w:num w:numId="8">
-    <w:abstractNumId w:val="8"/>
   </w:num>
 </w:numbering>
 </file>
@@ -5152,8 +4985,8 @@
       <w:bCs/>
     </w:rPr>
   </w:style>
-  <w:style w:type="character" w:styleId="Bullets">
-    <w:name w:val="Bullets"/>
+  <w:style w:type="character" w:styleId="Bulletsuser">
+    <w:name w:val="Bullets (user)"/>
     <w:qFormat/>
     <w:rPr>
       <w:rFonts w:ascii="OpenSymbol" w:hAnsi="OpenSymbol" w:eastAsia="OpenSymbol" w:cs="OpenSymbol"/>
@@ -5247,14 +5080,21 @@
       <w:szCs w:val="12"/>
     </w:rPr>
   </w:style>
-  <w:style w:type="paragraph" w:styleId="BlockQuotation">
-    <w:name w:val="Block Quotation"/>
+  <w:style w:type="paragraph" w:styleId="BlockQuotationuser">
+    <w:name w:val="Block Quotation (user)"/>
     <w:basedOn w:val="Normal"/>
     <w:qFormat/>
     <w:pPr>
       <w:spacing w:before="0" w:after="283"/>
       <w:ind w:hanging="0" w:start="567" w:end="567"/>
     </w:pPr>
+    <w:rPr/>
+  </w:style>
+  <w:style w:type="paragraph" w:styleId="Figure">
+    <w:name w:val="Figure"/>
+    <w:basedOn w:val="Caption"/>
+    <w:qFormat/>
+    <w:pPr/>
     <w:rPr/>
   </w:style>
 </w:styles>

</xml_diff>

<commit_message>
ly giai luong du lieu
</commit_message>
<xml_diff>
--- a/Doc/OnTap/6_SCAM_based_TCAM.docx
+++ b/Doc/OnTap/6_SCAM_based_TCAM.docx
@@ -4043,7 +4043,9 @@
                               <w:rPr/>
                             </w:pPr>
                             <w:r>
-                              <w:rPr/>
+                              <w:rPr>
+                                <w:color w:val="000000"/>
+                              </w:rPr>
                               <w:drawing>
                                 <wp:inline distT="0" distB="0" distL="0" distR="0">
                                   <wp:extent cx="1819275" cy="5534025"/>
@@ -4083,31 +4085,45 @@
                               </w:drawing>
                             </w:r>
                             <w:r>
-                              <w:rPr/>
+                              <w:rPr>
+                                <w:color w:val="000000"/>
+                              </w:rPr>
                               <w:t xml:space="preserve">Figure </w:t>
                             </w:r>
                             <w:r>
-                              <w:rPr/>
+                              <w:rPr>
+                                <w:color w:val="000000"/>
+                              </w:rPr>
                               <w:fldChar w:fldCharType="begin"/>
                             </w:r>
                             <w:r>
-                              <w:rPr/>
+                              <w:rPr>
+                                <w:color w:val="000000"/>
+                              </w:rPr>
                               <w:instrText xml:space="preserve"> SEQ Figure \* ARABIC </w:instrText>
                             </w:r>
                             <w:r>
-                              <w:rPr/>
+                              <w:rPr>
+                                <w:color w:val="000000"/>
+                              </w:rPr>
                               <w:fldChar w:fldCharType="separate"/>
                             </w:r>
                             <w:r>
-                              <w:rPr/>
+                              <w:rPr>
+                                <w:color w:val="000000"/>
+                              </w:rPr>
                               <w:t>1</w:t>
                             </w:r>
                             <w:r>
-                              <w:rPr/>
+                              <w:rPr>
+                                <w:color w:val="000000"/>
+                              </w:rPr>
                               <w:fldChar w:fldCharType="end"/>
                             </w:r>
                             <w:r>
-                              <w:rPr/>
+                              <w:rPr>
+                                <w:color w:val="000000"/>
+                              </w:rPr>
                               <w:t>:  Luồng dữ liệu SRAM_based_TCAM</w:t>
                             </w:r>
                           </w:p>
@@ -4136,7 +4152,9 @@
                         <w:rPr/>
                       </w:pPr>
                       <w:r>
-                        <w:rPr/>
+                        <w:rPr>
+                          <w:color w:val="000000"/>
+                        </w:rPr>
                         <w:drawing>
                           <wp:inline distT="0" distB="0" distL="0" distR="0">
                             <wp:extent cx="1819275" cy="5534025"/>
@@ -4176,31 +4194,45 @@
                         </w:drawing>
                       </w:r>
                       <w:r>
-                        <w:rPr/>
+                        <w:rPr>
+                          <w:color w:val="000000"/>
+                        </w:rPr>
                         <w:t xml:space="preserve">Figure </w:t>
                       </w:r>
                       <w:r>
-                        <w:rPr/>
+                        <w:rPr>
+                          <w:color w:val="000000"/>
+                        </w:rPr>
                         <w:fldChar w:fldCharType="begin"/>
                       </w:r>
                       <w:r>
-                        <w:rPr/>
+                        <w:rPr>
+                          <w:color w:val="000000"/>
+                        </w:rPr>
                         <w:instrText xml:space="preserve"> SEQ Figure \* ARABIC </w:instrText>
                       </w:r>
                       <w:r>
-                        <w:rPr/>
+                        <w:rPr>
+                          <w:color w:val="000000"/>
+                        </w:rPr>
                         <w:fldChar w:fldCharType="separate"/>
                       </w:r>
                       <w:r>
-                        <w:rPr/>
+                        <w:rPr>
+                          <w:color w:val="000000"/>
+                        </w:rPr>
                         <w:t>1</w:t>
                       </w:r>
                       <w:r>
-                        <w:rPr/>
+                        <w:rPr>
+                          <w:color w:val="000000"/>
+                        </w:rPr>
                         <w:fldChar w:fldCharType="end"/>
                       </w:r>
                       <w:r>
-                        <w:rPr/>
+                        <w:rPr>
+                          <w:color w:val="000000"/>
+                        </w:rPr>
                         <w:t>:  Luồng dữ liệu SRAM_based_TCAM</w:t>
                       </w:r>
                     </w:p>
@@ -4230,13 +4262,10 @@
       </w:pPr>
       <w:r>
         <w:rPr/>
-        <w:t xml:space="preserve"> </w:t>
-      </w:r>
-      <w:r>
         <mc:AlternateContent>
           <mc:Choice Requires="wps">
             <w:drawing>
-              <wp:anchor behindDoc="0" distT="0" distB="0" distL="0" distR="0" simplePos="0" locked="0" layoutInCell="0" allowOverlap="1" relativeHeight="6">
+              <wp:anchor behindDoc="0" distT="0" distB="0" distL="0" distR="0" simplePos="0" locked="0" layoutInCell="0" allowOverlap="1" relativeHeight="5">
                 <wp:simplePos x="0" y="0"/>
                 <wp:positionH relativeFrom="column">
                   <wp:posOffset>2336165</wp:posOffset>
@@ -4251,17 +4280,28 @@
                 <a:graphic xmlns:a="http://schemas.openxmlformats.org/drawingml/2006/main">
                   <a:graphicData uri="http://schemas.microsoft.com/office/word/2010/wordprocessingShape">
                     <wps:wsp>
-                      <wps:cNvSpPr txBox="1"/>
+                      <wps:cNvSpPr/>
                       <wps:spPr>
                         <a:xfrm>
                           <a:off x="0" y="0"/>
-                          <a:ext cx="1533525" cy="4528185"/>
+                          <a:ext cx="1533600" cy="4528080"/>
                         </a:xfrm>
-                        <a:prstGeom prst="rect"/>
+                        <a:prstGeom prst="rect">
+                          <a:avLst/>
+                        </a:prstGeom>
                         <a:solidFill>
-                          <a:srgbClr val="FFFFFF"/>
+                          <a:srgbClr val="ffffff"/>
                         </a:solidFill>
+                        <a:ln w="0">
+                          <a:noFill/>
+                        </a:ln>
                       </wps:spPr>
+                      <wps:style>
+                        <a:lnRef idx="0"/>
+                        <a:fillRef idx="0"/>
+                        <a:effectRef idx="0"/>
+                        <a:fontRef idx="minor"/>
+                      </wps:style>
                       <wps:txbx>
                         <w:txbxContent>
                           <w:p>
@@ -4276,7 +4316,7 @@
                                 <wp:inline distT="0" distB="0" distL="0" distR="0">
                                   <wp:extent cx="1533525" cy="4200525"/>
                                   <wp:effectExtent l="0" t="0" r="0" b="0"/>
-                                  <wp:docPr id="4" name="Image3" descr=""/>
+                                  <wp:docPr id="5" name="Image3" descr=""/>
                                   <wp:cNvGraphicFramePr>
                                     <a:graphicFrameLocks xmlns:a="http://schemas.openxmlformats.org/drawingml/2006/main" noChangeAspect="1"/>
                                   </wp:cNvGraphicFramePr>
@@ -4284,7 +4324,7 @@
                                     <a:graphicData uri="http://schemas.openxmlformats.org/drawingml/2006/picture">
                                       <pic:pic xmlns:pic="http://schemas.openxmlformats.org/drawingml/2006/picture">
                                         <pic:nvPicPr>
-                                          <pic:cNvPr id="4" name="Image3" descr=""/>
+                                          <pic:cNvPr id="5" name="Image3" descr=""/>
                                           <pic:cNvPicPr>
                                             <a:picLocks noChangeAspect="1" noChangeArrowheads="1"/>
                                           </pic:cNvPicPr>
@@ -4309,6 +4349,9 @@
                                   </a:graphic>
                                 </wp:inline>
                               </w:drawing>
+                            </w:r>
+                            <w:r>
+                              <w:rPr/>
                               <w:t xml:space="preserve">Figure </w:t>
                             </w:r>
                             <w:r>
@@ -4338,7 +4381,7 @@
                           </w:p>
                         </w:txbxContent>
                       </wps:txbx>
-                      <wps:bodyPr anchor="t" lIns="0" tIns="0" rIns="0" bIns="0">
+                      <wps:bodyPr lIns="0" rIns="0" tIns="0" bIns="0" anchor="t">
                         <a:noAutofit/>
                       </wps:bodyPr>
                     </wps:wsp>
@@ -4349,8 +4392,10 @@
           </mc:Choice>
           <mc:Fallback>
             <w:pict>
-              <v:rect style="position:absolute;rotation:-0;width:120.75pt;height:356.55pt;mso-wrap-distance-left:0pt;mso-wrap-distance-right:0pt;mso-wrap-distance-top:0pt;mso-wrap-distance-bottom:0pt;margin-top:8.3pt;mso-position-vertical-relative:text;margin-left:183.95pt;mso-position-horizontal-relative:text">
-                <v:textbox inset="0in,0in,0in,0in">
+              <v:rect id="shape_0" ID="Frame2" path="m0,0l-2147483645,0l-2147483645,-2147483646l0,-2147483646xe" fillcolor="white" stroked="f" o:allowincell="f" style="position:absolute;margin-left:183.95pt;margin-top:8.3pt;width:120.7pt;height:356.5pt;mso-wrap-style:square;v-text-anchor:top">
+                <v:fill o:detectmouseclick="t" type="solid" color2="black"/>
+                <v:stroke color="#3465a4" joinstyle="round" endcap="flat"/>
+                <v:textbox>
                   <w:txbxContent>
                     <w:p>
                       <w:pPr>
@@ -4364,7 +4409,7 @@
                           <wp:inline distT="0" distB="0" distL="0" distR="0">
                             <wp:extent cx="1533525" cy="4200525"/>
                             <wp:effectExtent l="0" t="0" r="0" b="0"/>
-                            <wp:docPr id="5" name="Image3" descr=""/>
+                            <wp:docPr id="6" name="Image3" descr=""/>
                             <wp:cNvGraphicFramePr>
                               <a:graphicFrameLocks xmlns:a="http://schemas.openxmlformats.org/drawingml/2006/main" noChangeAspect="1"/>
                             </wp:cNvGraphicFramePr>
@@ -4372,7 +4417,7 @@
                               <a:graphicData uri="http://schemas.openxmlformats.org/drawingml/2006/picture">
                                 <pic:pic xmlns:pic="http://schemas.openxmlformats.org/drawingml/2006/picture">
                                   <pic:nvPicPr>
-                                    <pic:cNvPr id="5" name="Image3" descr=""/>
+                                    <pic:cNvPr id="6" name="Image3" descr=""/>
                                     <pic:cNvPicPr>
                                       <a:picLocks noChangeAspect="1" noChangeArrowheads="1"/>
                                     </pic:cNvPicPr>
@@ -4397,6 +4442,9 @@
                             </a:graphic>
                           </wp:inline>
                         </w:drawing>
+                      </w:r>
+                      <w:r>
+                        <w:rPr/>
                         <w:t xml:space="preserve">Figure </w:t>
                       </w:r>
                       <w:r>
@@ -4432,6 +4480,10 @@
           </mc:Fallback>
         </mc:AlternateContent>
       </w:r>
+      <w:r>
+        <w:rPr/>
+        <w:t xml:space="preserve"> </w:t>
+      </w:r>
     </w:p>
     <w:p>
       <w:pPr>
@@ -4443,6 +4495,1263 @@
         <w:rPr/>
         <w:t xml:space="preserve">  </w:t>
       </w:r>
+      <w:r>
+        <w:rPr/>
+        <w:t xml:space="preserve">Ban đầu hệ thống nhận một </w:t>
+      </w:r>
+      <w:r>
+        <w:rPr>
+          <w:rStyle w:val="Strong"/>
+        </w:rPr>
+        <w:t>packet</w:t>
+      </w:r>
+      <w:r>
+        <w:rPr/>
+        <w:t xml:space="preserve">. Từ packet, ta </w:t>
+      </w:r>
+      <w:r>
+        <w:rPr>
+          <w:rStyle w:val="Strong"/>
+        </w:rPr>
+        <w:t>trích xuất packet header</w:t>
+      </w:r>
+      <w:r>
+        <w:rPr/>
+        <w:t xml:space="preserve"> (hoặc các trường cần tra cứu) để tạo thành </w:t>
+      </w:r>
+      <w:r>
+        <w:rPr>
+          <w:rStyle w:val="Strong"/>
+        </w:rPr>
+        <w:t>Search Key</w:t>
+      </w:r>
+      <w:r>
+        <w:rPr/>
+        <w:t xml:space="preserve">. Search Key được nạp vào </w:t>
+      </w:r>
+      <w:r>
+        <w:rPr>
+          <w:rStyle w:val="Strong"/>
+        </w:rPr>
+        <w:t>Input Register</w:t>
+      </w:r>
+      <w:r>
+        <w:rPr/>
+        <w:t xml:space="preserve"> để giữ ổn định trong suốt quá trình tìm kiếm. Đồng thời, </w:t>
+      </w:r>
+      <w:r>
+        <w:rPr>
+          <w:rStyle w:val="Strong"/>
+        </w:rPr>
+        <w:t>Address Counter</w:t>
+      </w:r>
+      <w:r>
+        <w:rPr/>
+        <w:t xml:space="preserve"> lần lượt đọc từng </w:t>
+      </w:r>
+      <w:r>
+        <w:rPr>
+          <w:rStyle w:val="Strong"/>
+        </w:rPr>
+        <w:t>Rule</w:t>
+      </w:r>
+      <w:r>
+        <w:rPr/>
+        <w:t xml:space="preserve"> trong SRAM. </w:t>
+      </w:r>
+      <w:r>
+        <w:rPr>
+          <w:rStyle w:val="Strong"/>
+        </w:rPr>
+        <w:t>Comparator</w:t>
+      </w:r>
+      <w:r>
+        <w:rPr/>
+        <w:t xml:space="preserve"> so sánh Search Key với từng Rule. Nếu có nhiều Rule cùng khớp, </w:t>
+      </w:r>
+      <w:r>
+        <w:rPr>
+          <w:rStyle w:val="Strong"/>
+        </w:rPr>
+        <w:t>Priority Encoder</w:t>
+      </w:r>
+      <w:r>
+        <w:rPr/>
+        <w:t xml:space="preserve"> sẽ chọn Rule có </w:t>
+      </w:r>
+      <w:r>
+        <w:rPr>
+          <w:rStyle w:val="Strong"/>
+        </w:rPr>
+        <w:t>độ ưu tiên cao nhất</w:t>
+      </w:r>
+      <w:r>
+        <w:rPr/>
+        <w:t xml:space="preserve"> (trong thiết kế cơ bản là địa chỉ nhỏ nhất) và xuất </w:t>
+      </w:r>
+      <w:r>
+        <w:rPr>
+          <w:rStyle w:val="SourceText"/>
+        </w:rPr>
+        <w:t>rule_id</w:t>
+      </w:r>
+      <w:r>
+        <w:rPr/>
+        <w:t xml:space="preserve"> cùng tín hiệu </w:t>
+      </w:r>
+      <w:r>
+        <w:rPr>
+          <w:rStyle w:val="SourceText"/>
+        </w:rPr>
+        <w:t>match_valid</w:t>
+      </w:r>
+      <w:r>
+        <w:rPr/>
+        <w:t>.</w:t>
+      </w:r>
+    </w:p>
+    <w:p>
+      <w:pPr>
+        <w:pStyle w:val="BodyText"/>
+        <w:spacing w:before="0" w:after="140"/>
+        <w:rPr/>
+      </w:pPr>
+      <w:r>
+        <w:rPr/>
+      </w:r>
+    </w:p>
+    <w:p>
+      <w:pPr>
+        <w:pStyle w:val="Heading1"/>
+        <w:numPr>
+          <w:ilvl w:val="0"/>
+          <w:numId w:val="1"/>
+        </w:numPr>
+        <w:ind w:hanging="0" w:left="0"/>
+        <w:rPr/>
+      </w:pPr>
+      <w:r>
+        <w:rPr/>
+        <w:t>Search Key là gì?</w:t>
+      </w:r>
+    </w:p>
+    <w:p>
+      <w:pPr>
+        <w:pStyle w:val="BodyText"/>
+        <w:spacing w:before="0" w:after="140"/>
+        <w:rPr/>
+      </w:pPr>
+      <w:r>
+        <w:rPr/>
+        <w:t>Ví dụ Header là</w:t>
+      </w:r>
+    </w:p>
+    <w:p>
+      <w:pPr>
+        <w:sectPr>
+          <w:type w:val="continuous"/>
+          <w:pgSz w:w="12240" w:h="15840"/>
+          <w:pgMar w:left="1134" w:right="1134" w:gutter="0" w:header="0" w:top="1134" w:footer="0" w:bottom="1134"/>
+          <w:formProt w:val="false"/>
+          <w:textDirection w:val="lrTb"/>
+          <w:docGrid w:type="default" w:linePitch="100" w:charSpace="0"/>
+        </w:sectPr>
+      </w:pPr>
+    </w:p>
+    <w:p>
+      <w:pPr>
+        <w:pStyle w:val="PreformattedText"/>
+        <w:ind w:hanging="0" w:left="0" w:right="0"/>
+        <w:rPr/>
+      </w:pPr>
+      <w:r>
+        <w:rPr>
+          <w:rStyle w:val="SourceText"/>
+        </w:rPr>
+        <w:t>Src IP      = 192.168.1.10</w:t>
+      </w:r>
+    </w:p>
+    <w:p>
+      <w:pPr>
+        <w:pStyle w:val="PreformattedText"/>
+        <w:rPr/>
+      </w:pPr>
+      <w:r>
+        <w:rPr/>
+      </w:r>
+    </w:p>
+    <w:p>
+      <w:pPr>
+        <w:pStyle w:val="PreformattedText"/>
+        <w:rPr/>
+      </w:pPr>
+      <w:r>
+        <w:rPr>
+          <w:rStyle w:val="SourceText"/>
+        </w:rPr>
+        <w:t>Dst IP      = 10.0.0.5</w:t>
+      </w:r>
+    </w:p>
+    <w:p>
+      <w:pPr>
+        <w:pStyle w:val="PreformattedText"/>
+        <w:rPr/>
+      </w:pPr>
+      <w:r>
+        <w:rPr/>
+      </w:r>
+    </w:p>
+    <w:p>
+      <w:pPr>
+        <w:pStyle w:val="PreformattedText"/>
+        <w:rPr/>
+      </w:pPr>
+      <w:r>
+        <w:rPr>
+          <w:rStyle w:val="SourceText"/>
+        </w:rPr>
+        <w:t>Protocol    = TCP</w:t>
+      </w:r>
+    </w:p>
+    <w:p>
+      <w:pPr>
+        <w:pStyle w:val="PreformattedText"/>
+        <w:rPr/>
+      </w:pPr>
+      <w:r>
+        <w:rPr/>
+      </w:r>
+    </w:p>
+    <w:p>
+      <w:pPr>
+        <w:pStyle w:val="PreformattedText"/>
+        <w:spacing w:before="0" w:after="283"/>
+        <w:rPr/>
+      </w:pPr>
+      <w:r>
+        <w:rPr>
+          <w:rStyle w:val="SourceText"/>
+        </w:rPr>
+        <w:t>Dst Port    = 80</w:t>
+      </w:r>
+    </w:p>
+    <w:p>
+      <w:pPr>
+        <w:sectPr>
+          <w:type w:val="continuous"/>
+          <w:pgSz w:w="12240" w:h="15840"/>
+          <w:pgMar w:left="1134" w:right="1134" w:gutter="0" w:header="0" w:top="1134" w:footer="0" w:bottom="1134"/>
+          <w:formProt w:val="false"/>
+          <w:textDirection w:val="lrTb"/>
+          <w:docGrid w:type="default" w:linePitch="100" w:charSpace="0"/>
+        </w:sectPr>
+      </w:pPr>
+    </w:p>
+    <w:p>
+      <w:pPr>
+        <w:pStyle w:val="BodyText"/>
+        <w:rPr/>
+      </w:pPr>
+      <w:r>
+        <w:rPr/>
+        <w:t>Ghép lại thành</w:t>
+      </w:r>
+    </w:p>
+    <w:p>
+      <w:pPr>
+        <w:sectPr>
+          <w:type w:val="continuous"/>
+          <w:pgSz w:w="12240" w:h="15840"/>
+          <w:pgMar w:left="1134" w:right="1134" w:gutter="0" w:header="0" w:top="1134" w:footer="0" w:bottom="1134"/>
+          <w:formProt w:val="false"/>
+          <w:textDirection w:val="lrTb"/>
+          <w:docGrid w:type="default" w:linePitch="100" w:charSpace="0"/>
+        </w:sectPr>
+      </w:pPr>
+    </w:p>
+    <w:p>
+      <w:pPr>
+        <w:pStyle w:val="PreformattedText"/>
+        <w:spacing w:before="0" w:after="283"/>
+        <w:ind w:hanging="0" w:left="0" w:right="0"/>
+        <w:rPr/>
+      </w:pPr>
+      <w:bookmarkStart w:id="9" w:name="code-block-viewer_Copy_1"/>
+      <w:bookmarkEnd w:id="9"/>
+      <w:r>
+        <w:rPr>
+          <w:rStyle w:val="SourceText"/>
+        </w:rPr>
+        <w:t>Search Key</w:t>
+      </w:r>
+    </w:p>
+    <w:p>
+      <w:pPr>
+        <w:sectPr>
+          <w:type w:val="continuous"/>
+          <w:pgSz w:w="12240" w:h="15840"/>
+          <w:pgMar w:left="1134" w:right="1134" w:gutter="0" w:header="0" w:top="1134" w:footer="0" w:bottom="1134"/>
+          <w:formProt w:val="false"/>
+          <w:textDirection w:val="lrTb"/>
+          <w:docGrid w:type="default" w:linePitch="100" w:charSpace="0"/>
+        </w:sectPr>
+      </w:pPr>
+    </w:p>
+    <w:p>
+      <w:pPr>
+        <w:pStyle w:val="BodyText"/>
+        <w:rPr/>
+      </w:pPr>
+      <w:r>
+        <w:rPr/>
+        <w:t>Search Key này đem so với Rule Table.</w:t>
+      </w:r>
+    </w:p>
+    <w:p>
+      <w:pPr>
+        <w:pStyle w:val="Heading1"/>
+        <w:numPr>
+          <w:ilvl w:val="0"/>
+          <w:numId w:val="1"/>
+        </w:numPr>
+        <w:ind w:hanging="0" w:left="0"/>
+        <w:rPr/>
+      </w:pPr>
+      <w:r>
+        <w:rPr/>
+        <w:t>Rule Table trong SRAM</w:t>
+      </w:r>
+    </w:p>
+    <w:p>
+      <w:pPr>
+        <w:pStyle w:val="BodyText"/>
+        <w:spacing w:before="0" w:after="140"/>
+        <w:rPr/>
+      </w:pPr>
+      <w:r>
+        <w:rPr/>
+        <w:t>Ví dụ</w:t>
+      </w:r>
+    </w:p>
+    <w:p>
+      <w:pPr>
+        <w:sectPr>
+          <w:type w:val="continuous"/>
+          <w:pgSz w:w="12240" w:h="15840"/>
+          <w:pgMar w:left="1134" w:right="1134" w:gutter="0" w:header="0" w:top="1134" w:footer="0" w:bottom="1134"/>
+          <w:formProt w:val="false"/>
+          <w:textDirection w:val="lrTb"/>
+          <w:docGrid w:type="default" w:linePitch="100" w:charSpace="0"/>
+        </w:sectPr>
+      </w:pPr>
+    </w:p>
+    <w:p>
+      <w:pPr>
+        <w:pStyle w:val="PreformattedText"/>
+        <w:ind w:hanging="0" w:left="0" w:right="0"/>
+        <w:rPr/>
+      </w:pPr>
+      <w:bookmarkStart w:id="10" w:name="code-block-viewer_Copy_2"/>
+      <w:bookmarkEnd w:id="10"/>
+      <w:r>
+        <w:rPr>
+          <w:rStyle w:val="SourceText"/>
+        </w:rPr>
+        <w:t>Rule 0</w:t>
+      </w:r>
+    </w:p>
+    <w:p>
+      <w:pPr>
+        <w:pStyle w:val="PreformattedText"/>
+        <w:rPr/>
+      </w:pPr>
+      <w:r>
+        <w:rPr/>
+      </w:r>
+    </w:p>
+    <w:p>
+      <w:pPr>
+        <w:pStyle w:val="PreformattedText"/>
+        <w:rPr/>
+      </w:pPr>
+      <w:r>
+        <w:rPr>
+          <w:rStyle w:val="SourceText"/>
+        </w:rPr>
+        <w:t>Dst Port = 80</w:t>
+      </w:r>
+    </w:p>
+    <w:p>
+      <w:pPr>
+        <w:pStyle w:val="PreformattedText"/>
+        <w:rPr/>
+      </w:pPr>
+      <w:r>
+        <w:rPr/>
+      </w:r>
+    </w:p>
+    <w:p>
+      <w:pPr>
+        <w:pStyle w:val="PreformattedText"/>
+        <w:rPr/>
+      </w:pPr>
+      <w:r>
+        <w:rPr>
+          <w:rStyle w:val="SourceText"/>
+        </w:rPr>
+        <w:t>TCP</w:t>
+      </w:r>
+    </w:p>
+    <w:p>
+      <w:pPr>
+        <w:pStyle w:val="PreformattedText"/>
+        <w:rPr/>
+      </w:pPr>
+      <w:r>
+        <w:rPr/>
+      </w:r>
+    </w:p>
+    <w:p>
+      <w:pPr>
+        <w:pStyle w:val="PreformattedText"/>
+        <w:rPr/>
+      </w:pPr>
+      <w:r>
+        <w:rPr>
+          <w:rStyle w:val="SourceText"/>
+        </w:rPr>
+        <w:t>---------</w:t>
+      </w:r>
+    </w:p>
+    <w:p>
+      <w:pPr>
+        <w:pStyle w:val="PreformattedText"/>
+        <w:spacing w:before="0" w:after="283"/>
+        <w:rPr/>
+      </w:pPr>
+      <w:r>
+        <w:rPr>
+          <w:rStyle w:val="SourceText"/>
+        </w:rPr>
+        <w:t>Forward Port 1</w:t>
+      </w:r>
+    </w:p>
+    <w:p>
+      <w:pPr>
+        <w:sectPr>
+          <w:type w:val="continuous"/>
+          <w:pgSz w:w="12240" w:h="15840"/>
+          <w:pgMar w:left="1134" w:right="1134" w:gutter="0" w:header="0" w:top="1134" w:footer="0" w:bottom="1134"/>
+          <w:formProt w:val="false"/>
+          <w:textDirection w:val="lrTb"/>
+          <w:docGrid w:type="default" w:linePitch="100" w:charSpace="0"/>
+        </w:sectPr>
+      </w:pPr>
+    </w:p>
+    <w:p>
+      <w:pPr>
+        <w:pStyle w:val="PreformattedText"/>
+        <w:ind w:hanging="0" w:left="0" w:right="0"/>
+        <w:rPr/>
+      </w:pPr>
+      <w:bookmarkStart w:id="11" w:name="code-block-viewer_Copy_3"/>
+      <w:bookmarkEnd w:id="11"/>
+      <w:r>
+        <w:rPr>
+          <w:rStyle w:val="SourceText"/>
+        </w:rPr>
+        <w:t>Rule 1</w:t>
+      </w:r>
+    </w:p>
+    <w:p>
+      <w:pPr>
+        <w:pStyle w:val="PreformattedText"/>
+        <w:rPr/>
+      </w:pPr>
+      <w:r>
+        <w:rPr/>
+      </w:r>
+    </w:p>
+    <w:p>
+      <w:pPr>
+        <w:pStyle w:val="PreformattedText"/>
+        <w:rPr/>
+      </w:pPr>
+      <w:r>
+        <w:rPr>
+          <w:rStyle w:val="SourceText"/>
+        </w:rPr>
+        <w:t>Dst Port = 22</w:t>
+      </w:r>
+    </w:p>
+    <w:p>
+      <w:pPr>
+        <w:pStyle w:val="PreformattedText"/>
+        <w:rPr/>
+      </w:pPr>
+      <w:r>
+        <w:rPr/>
+      </w:r>
+    </w:p>
+    <w:p>
+      <w:pPr>
+        <w:pStyle w:val="PreformattedText"/>
+        <w:rPr/>
+      </w:pPr>
+      <w:r>
+        <w:rPr>
+          <w:rStyle w:val="SourceText"/>
+        </w:rPr>
+        <w:t>TCP</w:t>
+      </w:r>
+    </w:p>
+    <w:p>
+      <w:pPr>
+        <w:pStyle w:val="PreformattedText"/>
+        <w:rPr/>
+      </w:pPr>
+      <w:r>
+        <w:rPr/>
+      </w:r>
+    </w:p>
+    <w:p>
+      <w:pPr>
+        <w:pStyle w:val="PreformattedText"/>
+        <w:rPr/>
+      </w:pPr>
+      <w:r>
+        <w:rPr>
+          <w:rStyle w:val="SourceText"/>
+        </w:rPr>
+        <w:t>---------</w:t>
+      </w:r>
+    </w:p>
+    <w:p>
+      <w:pPr>
+        <w:pStyle w:val="PreformattedText"/>
+        <w:spacing w:before="0" w:after="283"/>
+        <w:rPr/>
+      </w:pPr>
+      <w:r>
+        <w:rPr>
+          <w:rStyle w:val="SourceText"/>
+        </w:rPr>
+        <w:t>Forward Port 2</w:t>
+      </w:r>
+    </w:p>
+    <w:p>
+      <w:pPr>
+        <w:sectPr>
+          <w:type w:val="continuous"/>
+          <w:pgSz w:w="12240" w:h="15840"/>
+          <w:pgMar w:left="1134" w:right="1134" w:gutter="0" w:header="0" w:top="1134" w:footer="0" w:bottom="1134"/>
+          <w:formProt w:val="false"/>
+          <w:textDirection w:val="lrTb"/>
+          <w:docGrid w:type="default" w:linePitch="100" w:charSpace="0"/>
+        </w:sectPr>
+      </w:pPr>
+    </w:p>
+    <w:p>
+      <w:pPr>
+        <w:pStyle w:val="PreformattedText"/>
+        <w:ind w:hanging="0" w:left="0" w:right="0"/>
+        <w:rPr/>
+      </w:pPr>
+      <w:bookmarkStart w:id="12" w:name="code-block-viewer_Copy_4"/>
+      <w:bookmarkEnd w:id="12"/>
+      <w:r>
+        <w:rPr>
+          <w:rStyle w:val="SourceText"/>
+        </w:rPr>
+        <w:t>Rule 2</w:t>
+      </w:r>
+    </w:p>
+    <w:p>
+      <w:pPr>
+        <w:pStyle w:val="PreformattedText"/>
+        <w:rPr/>
+      </w:pPr>
+      <w:r>
+        <w:rPr/>
+      </w:r>
+    </w:p>
+    <w:p>
+      <w:pPr>
+        <w:pStyle w:val="PreformattedText"/>
+        <w:rPr/>
+      </w:pPr>
+      <w:r>
+        <w:rPr>
+          <w:rStyle w:val="SourceText"/>
+        </w:rPr>
+        <w:t>UDP</w:t>
+      </w:r>
+    </w:p>
+    <w:p>
+      <w:pPr>
+        <w:pStyle w:val="PreformattedText"/>
+        <w:rPr/>
+      </w:pPr>
+      <w:r>
+        <w:rPr/>
+      </w:r>
+    </w:p>
+    <w:p>
+      <w:pPr>
+        <w:pStyle w:val="PreformattedText"/>
+        <w:rPr/>
+      </w:pPr>
+      <w:r>
+        <w:rPr>
+          <w:rStyle w:val="SourceText"/>
+        </w:rPr>
+        <w:t>---------</w:t>
+      </w:r>
+    </w:p>
+    <w:p>
+      <w:pPr>
+        <w:pStyle w:val="PreformattedText"/>
+        <w:spacing w:before="0" w:after="283"/>
+        <w:rPr/>
+      </w:pPr>
+      <w:r>
+        <w:rPr>
+          <w:rStyle w:val="SourceText"/>
+        </w:rPr>
+        <w:t>Drop</w:t>
+      </w:r>
+    </w:p>
+    <w:p>
+      <w:pPr>
+        <w:sectPr>
+          <w:type w:val="continuous"/>
+          <w:pgSz w:w="12240" w:h="15840"/>
+          <w:pgMar w:left="1134" w:right="1134" w:gutter="0" w:header="0" w:top="1134" w:footer="0" w:bottom="1134"/>
+          <w:formProt w:val="false"/>
+          <w:textDirection w:val="lrTb"/>
+          <w:docGrid w:type="default" w:linePitch="100" w:charSpace="0"/>
+        </w:sectPr>
+      </w:pPr>
+    </w:p>
+    <w:p>
+      <w:pPr>
+        <w:pStyle w:val="BodyText"/>
+        <w:rPr/>
+      </w:pPr>
+      <w:r>
+        <w:rPr/>
+        <w:t>Comparator hỏi</w:t>
+      </w:r>
+    </w:p>
+    <w:p>
+      <w:pPr>
+        <w:sectPr>
+          <w:type w:val="continuous"/>
+          <w:pgSz w:w="12240" w:h="15840"/>
+          <w:pgMar w:left="1134" w:right="1134" w:gutter="0" w:header="0" w:top="1134" w:footer="0" w:bottom="1134"/>
+          <w:formProt w:val="false"/>
+          <w:textDirection w:val="lrTb"/>
+          <w:docGrid w:type="default" w:linePitch="100" w:charSpace="0"/>
+        </w:sectPr>
+      </w:pPr>
+    </w:p>
+    <w:p>
+      <w:pPr>
+        <w:pStyle w:val="PreformattedText"/>
+        <w:ind w:hanging="0" w:left="0" w:right="0"/>
+        <w:rPr/>
+      </w:pPr>
+      <w:bookmarkStart w:id="13" w:name="code-block-viewer_Copy_5"/>
+      <w:bookmarkEnd w:id="13"/>
+      <w:r>
+        <w:rPr>
+          <w:rStyle w:val="SourceText"/>
+        </w:rPr>
+        <w:t>Search Key</w:t>
+      </w:r>
+    </w:p>
+    <w:p>
+      <w:pPr>
+        <w:pStyle w:val="PreformattedText"/>
+        <w:rPr/>
+      </w:pPr>
+      <w:r>
+        <w:rPr/>
+      </w:r>
+    </w:p>
+    <w:p>
+      <w:pPr>
+        <w:pStyle w:val="PreformattedText"/>
+        <w:rPr/>
+      </w:pPr>
+      <w:r>
+        <w:rPr>
+          <w:rStyle w:val="SourceText"/>
+        </w:rPr>
+        <w:t>=</w:t>
+      </w:r>
+    </w:p>
+    <w:p>
+      <w:pPr>
+        <w:pStyle w:val="PreformattedText"/>
+        <w:rPr/>
+      </w:pPr>
+      <w:r>
+        <w:rPr/>
+      </w:r>
+    </w:p>
+    <w:p>
+      <w:pPr>
+        <w:pStyle w:val="PreformattedText"/>
+        <w:spacing w:before="0" w:after="283"/>
+        <w:rPr/>
+      </w:pPr>
+      <w:r>
+        <w:rPr>
+          <w:rStyle w:val="SourceText"/>
+        </w:rPr>
+        <w:t>Rule 0 ?</w:t>
+      </w:r>
+    </w:p>
+    <w:p>
+      <w:pPr>
+        <w:sectPr>
+          <w:type w:val="continuous"/>
+          <w:pgSz w:w="12240" w:h="15840"/>
+          <w:pgMar w:left="1134" w:right="1134" w:gutter="0" w:header="0" w:top="1134" w:footer="0" w:bottom="1134"/>
+          <w:formProt w:val="false"/>
+          <w:textDirection w:val="lrTb"/>
+          <w:docGrid w:type="default" w:linePitch="100" w:charSpace="0"/>
+        </w:sectPr>
+      </w:pPr>
+    </w:p>
+    <w:p>
+      <w:pPr>
+        <w:pStyle w:val="BodyText"/>
+        <w:rPr/>
+      </w:pPr>
+      <w:r>
+        <w:rPr/>
+        <w:t>Nếu đúng</w:t>
+      </w:r>
+    </w:p>
+    <w:p>
+      <w:pPr>
+        <w:sectPr>
+          <w:type w:val="continuous"/>
+          <w:pgSz w:w="12240" w:h="15840"/>
+          <w:pgMar w:left="1134" w:right="1134" w:gutter="0" w:header="0" w:top="1134" w:footer="0" w:bottom="1134"/>
+          <w:formProt w:val="false"/>
+          <w:textDirection w:val="lrTb"/>
+          <w:docGrid w:type="default" w:linePitch="100" w:charSpace="0"/>
+        </w:sectPr>
+      </w:pPr>
+    </w:p>
+    <w:p>
+      <w:pPr>
+        <w:pStyle w:val="PreformattedText"/>
+        <w:spacing w:before="0" w:after="283"/>
+        <w:ind w:hanging="0" w:left="0" w:right="0"/>
+        <w:rPr/>
+      </w:pPr>
+      <w:bookmarkStart w:id="14" w:name="code-block-viewer_Copy_6"/>
+      <w:bookmarkEnd w:id="14"/>
+      <w:r>
+        <w:rPr>
+          <w:rStyle w:val="SourceText"/>
+        </w:rPr>
+        <w:t>Match</w:t>
+      </w:r>
+    </w:p>
+    <w:p>
+      <w:pPr>
+        <w:sectPr>
+          <w:type w:val="continuous"/>
+          <w:pgSz w:w="12240" w:h="15840"/>
+          <w:pgMar w:left="1134" w:right="1134" w:gutter="0" w:header="0" w:top="1134" w:footer="0" w:bottom="1134"/>
+          <w:formProt w:val="false"/>
+          <w:textDirection w:val="lrTb"/>
+          <w:docGrid w:type="default" w:linePitch="100" w:charSpace="0"/>
+        </w:sectPr>
+      </w:pPr>
+    </w:p>
+    <w:p>
+      <w:pPr>
+        <w:pStyle w:val="BodyText"/>
+        <w:rPr/>
+      </w:pPr>
+      <w:r>
+        <w:rPr/>
+        <w:t>Sau đó</w:t>
+      </w:r>
+    </w:p>
+    <w:p>
+      <w:pPr>
+        <w:pStyle w:val="BodyText"/>
+        <w:rPr/>
+      </w:pPr>
+      <w:r>
+        <w:rPr/>
+        <w:t>Priority Encoder chọn Rule phù hợp.</w:t>
+      </w:r>
+    </w:p>
+    <w:p>
+      <w:pPr>
+        <w:pStyle w:val="Heading1"/>
+        <w:numPr>
+          <w:ilvl w:val="0"/>
+          <w:numId w:val="1"/>
+        </w:numPr>
+        <w:ind w:hanging="0" w:left="0"/>
+        <w:rPr/>
+      </w:pPr>
+      <w:r>
+        <w:rPr/>
+        <w:t>Vậy TCAM dùng để làm gì?</w:t>
+      </w:r>
+    </w:p>
+    <w:p>
+      <w:pPr>
+        <w:pStyle w:val="BodyText"/>
+        <w:spacing w:before="0" w:after="140"/>
+        <w:rPr/>
+      </w:pPr>
+      <w:r>
+        <w:rPr/>
+        <w:t xml:space="preserve">Có thể xem nó là một </w:t>
+      </w:r>
+      <w:r>
+        <w:rPr>
+          <w:rStyle w:val="Strong"/>
+        </w:rPr>
+        <w:t>bộ phân loại (classifier)</w:t>
+      </w:r>
+      <w:r>
+        <w:rPr/>
+        <w:t>.</w:t>
+      </w:r>
+    </w:p>
+    <w:p>
+      <w:pPr>
+        <w:pStyle w:val="BodyText"/>
+        <w:rPr/>
+      </w:pPr>
+      <w:r>
+        <w:rPr/>
+        <w:t>Nó trả lời câu hỏi:</w:t>
+      </w:r>
+    </w:p>
+    <w:p>
+      <w:pPr>
+        <w:pStyle w:val="BlockQuotation"/>
+        <w:rPr/>
+      </w:pPr>
+      <w:r>
+        <w:rPr/>
+        <w:t>"Packet này thuộc loại nào?"</w:t>
+      </w:r>
+    </w:p>
+    <w:p>
+      <w:pPr>
+        <w:pStyle w:val="BodyText"/>
+        <w:rPr/>
+      </w:pPr>
+      <w:r>
+        <w:rPr/>
+        <w:t>Ví dụ</w:t>
+      </w:r>
+    </w:p>
+    <w:p>
+      <w:pPr>
+        <w:sectPr>
+          <w:type w:val="continuous"/>
+          <w:pgSz w:w="12240" w:h="15840"/>
+          <w:pgMar w:left="1134" w:right="1134" w:gutter="0" w:header="0" w:top="1134" w:footer="0" w:bottom="1134"/>
+          <w:formProt w:val="false"/>
+          <w:textDirection w:val="lrTb"/>
+          <w:docGrid w:type="default" w:linePitch="100" w:charSpace="0"/>
+        </w:sectPr>
+      </w:pPr>
+    </w:p>
+    <w:p>
+      <w:pPr>
+        <w:pStyle w:val="PreformattedText"/>
+        <w:ind w:hanging="0" w:left="0" w:right="0"/>
+        <w:rPr/>
+      </w:pPr>
+      <w:bookmarkStart w:id="15" w:name="code-block-viewer_Copy_7"/>
+      <w:bookmarkEnd w:id="15"/>
+      <w:r>
+        <w:rPr>
+          <w:rStyle w:val="SourceText"/>
+        </w:rPr>
+        <w:t>Packet A</w:t>
+      </w:r>
+    </w:p>
+    <w:p>
+      <w:pPr>
+        <w:pStyle w:val="PreformattedText"/>
+        <w:rPr/>
+      </w:pPr>
+      <w:r>
+        <w:rPr/>
+      </w:r>
+    </w:p>
+    <w:p>
+      <w:pPr>
+        <w:pStyle w:val="PreformattedText"/>
+        <w:rPr/>
+      </w:pPr>
+      <w:r>
+        <w:rPr>
+          <w:rStyle w:val="SourceText"/>
+        </w:rPr>
+        <w:t>↓</w:t>
+      </w:r>
+    </w:p>
+    <w:p>
+      <w:pPr>
+        <w:pStyle w:val="PreformattedText"/>
+        <w:rPr/>
+      </w:pPr>
+      <w:r>
+        <w:rPr/>
+      </w:r>
+    </w:p>
+    <w:p>
+      <w:pPr>
+        <w:pStyle w:val="PreformattedText"/>
+        <w:rPr/>
+      </w:pPr>
+      <w:r>
+        <w:rPr>
+          <w:rStyle w:val="SourceText"/>
+        </w:rPr>
+        <w:t>Rule 3</w:t>
+      </w:r>
+    </w:p>
+    <w:p>
+      <w:pPr>
+        <w:pStyle w:val="PreformattedText"/>
+        <w:rPr/>
+      </w:pPr>
+      <w:r>
+        <w:rPr/>
+      </w:r>
+    </w:p>
+    <w:p>
+      <w:pPr>
+        <w:pStyle w:val="PreformattedText"/>
+        <w:rPr/>
+      </w:pPr>
+      <w:r>
+        <w:rPr>
+          <w:rStyle w:val="SourceText"/>
+        </w:rPr>
+        <w:t>↓</w:t>
+      </w:r>
+    </w:p>
+    <w:p>
+      <w:pPr>
+        <w:pStyle w:val="PreformattedText"/>
+        <w:rPr/>
+      </w:pPr>
+      <w:r>
+        <w:rPr/>
+      </w:r>
+    </w:p>
+    <w:p>
+      <w:pPr>
+        <w:pStyle w:val="PreformattedText"/>
+        <w:spacing w:before="0" w:after="283"/>
+        <w:rPr/>
+      </w:pPr>
+      <w:r>
+        <w:rPr>
+          <w:rStyle w:val="SourceText"/>
+        </w:rPr>
+        <w:t>Cho đi Port 5</w:t>
+      </w:r>
+    </w:p>
+    <w:p>
+      <w:pPr>
+        <w:sectPr>
+          <w:type w:val="continuous"/>
+          <w:pgSz w:w="12240" w:h="15840"/>
+          <w:pgMar w:left="1134" w:right="1134" w:gutter="0" w:header="0" w:top="1134" w:footer="0" w:bottom="1134"/>
+          <w:formProt w:val="false"/>
+          <w:textDirection w:val="lrTb"/>
+          <w:docGrid w:type="default" w:linePitch="100" w:charSpace="0"/>
+        </w:sectPr>
+      </w:pPr>
+    </w:p>
+    <w:p>
+      <w:pPr>
+        <w:pStyle w:val="BodyText"/>
+        <w:rPr/>
+      </w:pPr>
+      <w:r>
+        <w:rPr/>
+        <w:t>Hoặc</w:t>
+      </w:r>
+    </w:p>
+    <w:p>
+      <w:pPr>
+        <w:sectPr>
+          <w:type w:val="continuous"/>
+          <w:pgSz w:w="12240" w:h="15840"/>
+          <w:pgMar w:left="1134" w:right="1134" w:gutter="0" w:header="0" w:top="1134" w:footer="0" w:bottom="1134"/>
+          <w:formProt w:val="false"/>
+          <w:textDirection w:val="lrTb"/>
+          <w:docGrid w:type="default" w:linePitch="100" w:charSpace="0"/>
+        </w:sectPr>
+      </w:pPr>
+    </w:p>
+    <w:p>
+      <w:pPr>
+        <w:pStyle w:val="PreformattedText"/>
+        <w:ind w:hanging="0" w:left="0" w:right="0"/>
+        <w:rPr/>
+      </w:pPr>
+      <w:bookmarkStart w:id="16" w:name="code-block-viewer_Copy_8"/>
+      <w:bookmarkEnd w:id="16"/>
+      <w:r>
+        <w:rPr>
+          <w:rStyle w:val="SourceText"/>
+        </w:rPr>
+        <w:t>Packet B</w:t>
+      </w:r>
+    </w:p>
+    <w:p>
+      <w:pPr>
+        <w:pStyle w:val="PreformattedText"/>
+        <w:rPr/>
+      </w:pPr>
+      <w:r>
+        <w:rPr/>
+      </w:r>
+    </w:p>
+    <w:p>
+      <w:pPr>
+        <w:pStyle w:val="PreformattedText"/>
+        <w:rPr/>
+      </w:pPr>
+      <w:r>
+        <w:rPr>
+          <w:rStyle w:val="SourceText"/>
+        </w:rPr>
+        <w:t>↓</w:t>
+      </w:r>
+    </w:p>
+    <w:p>
+      <w:pPr>
+        <w:pStyle w:val="PreformattedText"/>
+        <w:rPr/>
+      </w:pPr>
+      <w:r>
+        <w:rPr/>
+      </w:r>
+    </w:p>
+    <w:p>
+      <w:pPr>
+        <w:pStyle w:val="PreformattedText"/>
+        <w:rPr/>
+      </w:pPr>
+      <w:r>
+        <w:rPr>
+          <w:rStyle w:val="SourceText"/>
+        </w:rPr>
+        <w:t>Rule 10</w:t>
+      </w:r>
+    </w:p>
+    <w:p>
+      <w:pPr>
+        <w:pStyle w:val="PreformattedText"/>
+        <w:rPr/>
+      </w:pPr>
+      <w:r>
+        <w:rPr/>
+      </w:r>
+    </w:p>
+    <w:p>
+      <w:pPr>
+        <w:pStyle w:val="PreformattedText"/>
+        <w:rPr/>
+      </w:pPr>
+      <w:r>
+        <w:rPr>
+          <w:rStyle w:val="SourceText"/>
+        </w:rPr>
+        <w:t>↓</w:t>
+      </w:r>
+    </w:p>
+    <w:p>
+      <w:pPr>
+        <w:pStyle w:val="PreformattedText"/>
+        <w:rPr/>
+      </w:pPr>
+      <w:r>
+        <w:rPr/>
+      </w:r>
+    </w:p>
+    <w:p>
+      <w:pPr>
+        <w:pStyle w:val="PreformattedText"/>
+        <w:spacing w:before="0" w:after="283"/>
+        <w:rPr/>
+      </w:pPr>
+      <w:r>
+        <w:rPr>
+          <w:rStyle w:val="SourceText"/>
+        </w:rPr>
+        <w:t>Drop</w:t>
+      </w:r>
+    </w:p>
+    <w:p>
+      <w:pPr>
+        <w:sectPr>
+          <w:type w:val="continuous"/>
+          <w:pgSz w:w="12240" w:h="15840"/>
+          <w:pgMar w:left="1134" w:right="1134" w:gutter="0" w:header="0" w:top="1134" w:footer="0" w:bottom="1134"/>
+          <w:formProt w:val="false"/>
+          <w:textDirection w:val="lrTb"/>
+          <w:docGrid w:type="default" w:linePitch="100" w:charSpace="0"/>
+        </w:sectPr>
+      </w:pPr>
+    </w:p>
+    <w:p>
+      <w:pPr>
+        <w:pStyle w:val="BodyText"/>
+        <w:rPr/>
+      </w:pPr>
+      <w:r>
+        <w:rPr/>
+        <w:t>Hoặc</w:t>
+      </w:r>
+    </w:p>
+    <w:p>
+      <w:pPr>
+        <w:sectPr>
+          <w:type w:val="continuous"/>
+          <w:pgSz w:w="12240" w:h="15840"/>
+          <w:pgMar w:left="1134" w:right="1134" w:gutter="0" w:header="0" w:top="1134" w:footer="0" w:bottom="1134"/>
+          <w:formProt w:val="false"/>
+          <w:textDirection w:val="lrTb"/>
+          <w:docGrid w:type="default" w:linePitch="100" w:charSpace="0"/>
+        </w:sectPr>
+      </w:pPr>
+    </w:p>
+    <w:p>
+      <w:pPr>
+        <w:pStyle w:val="PreformattedText"/>
+        <w:ind w:hanging="0" w:left="0" w:right="0"/>
+        <w:rPr/>
+      </w:pPr>
+      <w:bookmarkStart w:id="17" w:name="code-block-viewer_Copy_9"/>
+      <w:bookmarkEnd w:id="17"/>
+      <w:r>
+        <w:rPr>
+          <w:rStyle w:val="SourceText"/>
+        </w:rPr>
+        <w:t>Packet C</w:t>
+      </w:r>
+    </w:p>
+    <w:p>
+      <w:pPr>
+        <w:pStyle w:val="PreformattedText"/>
+        <w:rPr/>
+      </w:pPr>
+      <w:r>
+        <w:rPr/>
+      </w:r>
+    </w:p>
+    <w:p>
+      <w:pPr>
+        <w:pStyle w:val="PreformattedText"/>
+        <w:rPr/>
+      </w:pPr>
+      <w:r>
+        <w:rPr>
+          <w:rStyle w:val="SourceText"/>
+        </w:rPr>
+        <w:t>↓</w:t>
+      </w:r>
+    </w:p>
+    <w:p>
+      <w:pPr>
+        <w:pStyle w:val="PreformattedText"/>
+        <w:rPr/>
+      </w:pPr>
+      <w:r>
+        <w:rPr/>
+      </w:r>
+    </w:p>
+    <w:p>
+      <w:pPr>
+        <w:pStyle w:val="PreformattedText"/>
+        <w:rPr/>
+      </w:pPr>
+      <w:r>
+        <w:rPr>
+          <w:rStyle w:val="SourceText"/>
+        </w:rPr>
+        <w:t>Rule 25</w:t>
+      </w:r>
+    </w:p>
+    <w:p>
+      <w:pPr>
+        <w:pStyle w:val="PreformattedText"/>
+        <w:rPr/>
+      </w:pPr>
+      <w:r>
+        <w:rPr/>
+      </w:r>
+    </w:p>
+    <w:p>
+      <w:pPr>
+        <w:pStyle w:val="PreformattedText"/>
+        <w:rPr/>
+      </w:pPr>
+      <w:r>
+        <w:rPr>
+          <w:rStyle w:val="SourceText"/>
+        </w:rPr>
+        <w:t>↓</w:t>
+      </w:r>
+    </w:p>
+    <w:p>
+      <w:pPr>
+        <w:pStyle w:val="PreformattedText"/>
+        <w:rPr/>
+      </w:pPr>
+      <w:r>
+        <w:rPr/>
+      </w:r>
+    </w:p>
+    <w:p>
+      <w:pPr>
+        <w:pStyle w:val="PreformattedText"/>
+        <w:spacing w:before="0" w:after="283"/>
+        <w:rPr/>
+      </w:pPr>
+      <w:r>
+        <w:rPr>
+          <w:rStyle w:val="SourceText"/>
+        </w:rPr>
+        <w:t>QoS mức cao</w:t>
+      </w:r>
+    </w:p>
+    <w:p>
+      <w:pPr>
+        <w:sectPr>
+          <w:type w:val="continuous"/>
+          <w:pgSz w:w="12240" w:h="15840"/>
+          <w:pgMar w:left="1134" w:right="1134" w:gutter="0" w:header="0" w:top="1134" w:footer="0" w:bottom="1134"/>
+          <w:formProt w:val="false"/>
+          <w:textDirection w:val="lrTb"/>
+          <w:docGrid w:type="default" w:linePitch="100" w:charSpace="0"/>
+        </w:sectPr>
+      </w:pPr>
     </w:p>
     <w:p>
       <w:pPr>

</xml_diff>